<commit_message>
deleting png and adding pdf diagrams and adding pdf verions of documents
</commit_message>
<xml_diff>
--- a/Appendix C IEEE 830 Template version 3.docx
+++ b/Appendix C IEEE 830 Template version 3.docx
@@ -124,27 +124,7 @@
           <w:szCs w:val="20"/>
           <w:lang w:val="en-US"/>
         </w:rPr>
-        <w:t xml:space="preserve"> </w:t>
-      </w:r>
-      <w:proofErr w:type="spellStart"/>
-      <w:r>
-        <w:rPr>
-          <w:rFonts w:asciiTheme="majorBidi" w:hAnsiTheme="majorBidi" w:cstheme="majorBidi"/>
-          <w:sz w:val="20"/>
-          <w:szCs w:val="20"/>
-          <w:lang w:val="en-US"/>
-        </w:rPr>
-        <w:t>GameStream</w:t>
-      </w:r>
-      <w:proofErr w:type="spellEnd"/>
-      <w:r>
-        <w:rPr>
-          <w:rFonts w:asciiTheme="majorBidi" w:hAnsiTheme="majorBidi" w:cstheme="majorBidi"/>
-          <w:sz w:val="20"/>
-          <w:szCs w:val="20"/>
-          <w:lang w:val="en-US"/>
-        </w:rPr>
-        <w:t xml:space="preserve"> Hub</w:t>
+        <w:t xml:space="preserve"> GameStream Hub</w:t>
       </w:r>
       <w:r>
         <w:rPr>
@@ -297,7 +277,35 @@
           <w:lang w:val="en-US" w:eastAsia="en-GB"/>
           <w14:ligatures w14:val="none"/>
         </w:rPr>
-        <w:t>March 12, 2026</w:t>
+        <w:t xml:space="preserve">April </w:t>
+      </w:r>
+      <w:r>
+        <w:rPr>
+          <w:rFonts w:asciiTheme="majorBidi" w:eastAsia="Times New Roman" w:hAnsiTheme="majorBidi" w:cstheme="majorBidi"/>
+          <w:b/>
+          <w:bCs/>
+          <w:kern w:val="0"/>
+          <w:sz w:val="20"/>
+          <w:szCs w:val="20"/>
+          <w:lang w:val="en-US" w:eastAsia="en-GB"/>
+          <w14:ligatures w14:val="none"/>
+        </w:rPr>
+        <w:t>7</w:t>
+      </w:r>
+      <w:bookmarkStart w:id="0" w:name="_GoBack"/>
+      <w:bookmarkEnd w:id="0"/>
+      <w:r>
+        <w:rPr>
+          <w:rFonts w:asciiTheme="majorBidi" w:eastAsia="Times New Roman" w:hAnsiTheme="majorBidi" w:cstheme="majorBidi"/>
+          <w:b/>
+          <w:bCs/>
+          <w:kern w:val="0"/>
+          <w:sz w:val="20"/>
+          <w:szCs w:val="20"/>
+          <w:lang w:val="en-US" w:eastAsia="en-GB"/>
+          <w14:ligatures w14:val="none"/>
+        </w:rPr>
+        <w:t xml:space="preserve"> , 2026</w:t>
       </w:r>
     </w:p>
     <w:p>
@@ -1342,27 +1350,7 @@
           <w:lang w:val="en-US" w:eastAsia="uk-UA"/>
           <w14:ligatures w14:val="none"/>
         </w:rPr>
-        <w:t>This document specifies the software requirements for "</w:t>
-      </w:r>
-      <w:proofErr w:type="spellStart"/>
-      <w:r>
-        <w:rPr>
-          <w:rFonts w:ascii="Times New Roman" w:eastAsia="Times New Roman" w:hAnsi="Times New Roman" w:cs="Times New Roman"/>
-          <w:kern w:val="0"/>
-          <w:lang w:val="en-US" w:eastAsia="uk-UA"/>
-          <w14:ligatures w14:val="none"/>
-        </w:rPr>
-        <w:t>GameStream</w:t>
-      </w:r>
-      <w:proofErr w:type="spellEnd"/>
-      <w:r>
-        <w:rPr>
-          <w:rFonts w:ascii="Times New Roman" w:eastAsia="Times New Roman" w:hAnsi="Times New Roman" w:cs="Times New Roman"/>
-          <w:kern w:val="0"/>
-          <w:lang w:val="en-US" w:eastAsia="uk-UA"/>
-          <w14:ligatures w14:val="none"/>
-        </w:rPr>
-        <w:t xml:space="preserve"> Hub" version 1.0. The system is designed to provide a digital marketplace for video games, enabling users to </w:t>
+        <w:t xml:space="preserve">This document specifies the software requirements for "GameStream Hub" version 1.0. The system is designed to provide a digital marketplace for video games, enabling users to </w:t>
       </w:r>
       <w:r>
         <w:rPr>
@@ -1577,25 +1565,14 @@
           <w:lang w:val="en-US"/>
         </w:rPr>
       </w:pPr>
-      <w:proofErr w:type="spellStart"/>
-      <w:r>
-        <w:rPr>
-          <w:rFonts w:asciiTheme="majorBidi" w:hAnsiTheme="majorBidi" w:cstheme="majorBidi"/>
-          <w:sz w:val="20"/>
-          <w:szCs w:val="20"/>
-          <w:lang w:val="en-US"/>
-        </w:rPr>
-        <w:t>GameStream</w:t>
-      </w:r>
-      <w:proofErr w:type="spellEnd"/>
-      <w:r>
-        <w:rPr>
-          <w:rFonts w:asciiTheme="majorBidi" w:hAnsiTheme="majorBidi" w:cstheme="majorBidi"/>
-          <w:sz w:val="20"/>
-          <w:szCs w:val="20"/>
-          <w:lang w:val="en-US"/>
-        </w:rPr>
-        <w:t xml:space="preserve"> Hub is a self-contained digital distribution platform. Its primary goal is to bridge the gap between game developers and players by providing a secure environment for transactions, game delivery, and bug reporting.</w:t>
+      <w:r>
+        <w:rPr>
+          <w:rFonts w:asciiTheme="majorBidi" w:hAnsiTheme="majorBidi" w:cstheme="majorBidi"/>
+          <w:sz w:val="20"/>
+          <w:szCs w:val="20"/>
+          <w:lang w:val="en-US"/>
+        </w:rPr>
+        <w:t>GameStream Hub is a self-contained digital distribution platform. Its primary goal is to bridge the gap between game developers and players by providing a secure environment for transactions, game delivery, and bug reporting.</w:t>
       </w:r>
     </w:p>
     <w:p>
@@ -1702,25 +1679,14 @@
           <w:lang w:val="en-US"/>
         </w:rPr>
       </w:pPr>
-      <w:proofErr w:type="spellStart"/>
-      <w:r>
-        <w:rPr>
-          <w:rFonts w:asciiTheme="majorBidi" w:hAnsiTheme="majorBidi" w:cstheme="majorBidi"/>
-          <w:sz w:val="20"/>
-          <w:szCs w:val="20"/>
-          <w:lang w:val="en-US"/>
-        </w:rPr>
-        <w:t>GameStream</w:t>
-      </w:r>
-      <w:proofErr w:type="spellEnd"/>
-      <w:r>
-        <w:rPr>
-          <w:rFonts w:asciiTheme="majorBidi" w:hAnsiTheme="majorBidi" w:cstheme="majorBidi"/>
-          <w:sz w:val="20"/>
-          <w:szCs w:val="20"/>
-          <w:lang w:val="en-US"/>
-        </w:rPr>
-        <w:t xml:space="preserve"> Hub is a new, standalone software system designed to emulate the core functionalities of platforms like Steam. It manages the entire lifecycle of a game from a developer's perspective (publishing) to a customer's perspective (playing).</w:t>
+      <w:r>
+        <w:rPr>
+          <w:rFonts w:asciiTheme="majorBidi" w:hAnsiTheme="majorBidi" w:cstheme="majorBidi"/>
+          <w:sz w:val="20"/>
+          <w:szCs w:val="20"/>
+          <w:lang w:val="en-US"/>
+        </w:rPr>
+        <w:t>GameStream Hub is a new, standalone software system designed to emulate the core functionalities of platforms like Steam. It manages the entire lifecycle of a game from a developer's perspective (publishing) to a customer's perspective (playing).</w:t>
       </w:r>
     </w:p>
     <w:p>
@@ -2258,27 +2224,7 @@
           <w:szCs w:val="20"/>
           <w:lang w:val="en-US"/>
         </w:rPr>
-        <w:t xml:space="preserve">To illustrate the structural design of the </w:t>
-      </w:r>
-      <w:proofErr w:type="spellStart"/>
-      <w:r>
-        <w:rPr>
-          <w:rFonts w:asciiTheme="majorBidi" w:hAnsiTheme="majorBidi" w:cstheme="majorBidi"/>
-          <w:sz w:val="20"/>
-          <w:szCs w:val="20"/>
-          <w:lang w:val="en-US"/>
-        </w:rPr>
-        <w:t>GameStream</w:t>
-      </w:r>
-      <w:proofErr w:type="spellEnd"/>
-      <w:r>
-        <w:rPr>
-          <w:rFonts w:asciiTheme="majorBidi" w:hAnsiTheme="majorBidi" w:cstheme="majorBidi"/>
-          <w:sz w:val="20"/>
-          <w:szCs w:val="20"/>
-          <w:lang w:val="en-US"/>
-        </w:rPr>
-        <w:t xml:space="preserve"> Hub, the following Class Diagram defines the primary entities, their attributes, and relationships.</w:t>
+        <w:t>To illustrate the structural design of the GameStream Hub, the following Class Diagram defines the primary entities, their attributes, and relationships.</w:t>
       </w:r>
     </w:p>
     <w:p>
@@ -2365,25 +2311,7 @@
           <w:szCs w:val="20"/>
           <w:lang w:val="en-US"/>
         </w:rPr>
-        <w:t xml:space="preserve">Figure 1. Class Diagram for </w:t>
-      </w:r>
-      <w:proofErr w:type="spellStart"/>
-      <w:r>
-        <w:rPr>
-          <w:sz w:val="20"/>
-          <w:szCs w:val="20"/>
-          <w:lang w:val="en-US"/>
-        </w:rPr>
-        <w:t>GameStream</w:t>
-      </w:r>
-      <w:proofErr w:type="spellEnd"/>
-      <w:r>
-        <w:rPr>
-          <w:sz w:val="20"/>
-          <w:szCs w:val="20"/>
-          <w:lang w:val="en-US"/>
-        </w:rPr>
-        <w:t xml:space="preserve"> Hub</w:t>
+        <w:t>Figure 1. Class Diagram for GameStream Hub</w:t>
       </w:r>
     </w:p>
     <w:p>
@@ -2989,8 +2917,6 @@
         </w:rPr>
         <w:t>. Entity-Relationship Diagram (ERD)</w:t>
       </w:r>
-      <w:bookmarkStart w:id="0" w:name="_GoBack"/>
-      <w:bookmarkEnd w:id="0"/>
     </w:p>
     <w:p>
       <w:pPr>
@@ -3294,27 +3220,7 @@
           <w:szCs w:val="20"/>
           <w:lang w:val="en-US"/>
         </w:rPr>
-        <w:t xml:space="preserve"> User authentication must utilize secure hashing algorithms (e.g., Argon2 or </w:t>
-      </w:r>
-      <w:proofErr w:type="spellStart"/>
-      <w:r>
-        <w:rPr>
-          <w:rFonts w:asciiTheme="majorBidi" w:hAnsiTheme="majorBidi" w:cstheme="majorBidi"/>
-          <w:sz w:val="20"/>
-          <w:szCs w:val="20"/>
-          <w:lang w:val="en-US"/>
-        </w:rPr>
-        <w:t>BCrypt</w:t>
-      </w:r>
-      <w:proofErr w:type="spellEnd"/>
-      <w:r>
-        <w:rPr>
-          <w:rFonts w:asciiTheme="majorBidi" w:hAnsiTheme="majorBidi" w:cstheme="majorBidi"/>
-          <w:sz w:val="20"/>
-          <w:szCs w:val="20"/>
-          <w:lang w:val="en-US"/>
-        </w:rPr>
-        <w:t>).</w:t>
+        <w:t xml:space="preserve"> User authentication must utilize secure hashing algorithms (e.g., Argon2 or BCrypt).</w:t>
       </w:r>
     </w:p>
     <w:sectPr>
@@ -8227,7 +8133,7 @@
 </file>
 
 <file path=customXml/itemProps1.xml><?xml version="1.0" encoding="utf-8"?>
-<ds:datastoreItem xmlns:ds="http://schemas.openxmlformats.org/officeDocument/2006/customXml" ds:itemID="{3C5001D0-9C86-42B9-BB14-21E00B27E5BE}">
+<ds:datastoreItem xmlns:ds="http://schemas.openxmlformats.org/officeDocument/2006/customXml" ds:itemID="{9D12765B-C9C5-48EE-BF67-553BE0DF9632}">
   <ds:schemaRefs>
     <ds:schemaRef ds:uri="http://schemas.openxmlformats.org/officeDocument/2006/bibliography"/>
   </ds:schemaRefs>

</xml_diff>